<commit_message>
Tunable with different Sb2Se3 layer configuration
</commit_message>
<xml_diff>
--- a/paper/[OptCommun] Design and Simulation of Sb2Se3-based Switchable Filter using TMM.docx
+++ b/paper/[OptCommun] Design and Simulation of Sb2Se3-based Switchable Filter using TMM.docx
@@ -20428,7 +20428,22 @@
         <w:fldChar w:fldCharType="end"/>
       </w:r>
       <w:r>
-        <w:t xml:space="preserve">. </w:t>
+        <w:t xml:space="preserve">, </w:t>
+      </w:r>
+      <w:r>
+        <w:rPr>
+          <w:highlight w:val="yellow"/>
+        </w:rPr>
+        <w:t>although a simulation software such as COMSOL would also be applicable</w:t>
+      </w:r>
+      <w:r>
+        <w:rPr>
+          <w:highlight w:val="yellow"/>
+        </w:rPr>
+        <w:t>.</w:t>
+      </w:r>
+      <w:r>
+        <w:t xml:space="preserve"> </w:t>
       </w:r>
       <w:r>
         <w:t xml:space="preserve">In some simulation works, the substrate index is </w:t>
@@ -30581,7 +30596,19 @@
         <w:t>E</w:t>
       </w:r>
       <w:r>
-        <w:t>dge-filter design required multiple layers of Sb</w:t>
+        <w:t>dge-filter design</w:t>
+      </w:r>
+      <w:r>
+        <w:t>s</w:t>
+      </w:r>
+      <w:r>
+        <w:t xml:space="preserve"> </w:t>
+      </w:r>
+      <w:r>
+        <w:t>have</w:t>
+      </w:r>
+      <w:r>
+        <w:t xml:space="preserve"> multiple layers of Sb</w:t>
       </w:r>
       <w:r>
         <w:rPr>
@@ -30599,25 +30626,16 @@
         <w:t>3</w:t>
       </w:r>
       <w:r>
-        <w:t xml:space="preserve">, this </w:t>
-      </w:r>
-      <w:r>
-        <w:t>complicates</w:t>
-      </w:r>
-      <w:r>
-        <w:t xml:space="preserve"> the setup for phase switching</w:t>
-      </w:r>
-      <w:r>
-        <w:t xml:space="preserve"> by electrical heating</w:t>
-      </w:r>
-      <w:r>
-        <w:t xml:space="preserve">. And </w:t>
-      </w:r>
-      <w:r>
-        <w:t>for</w:t>
-      </w:r>
-      <w:r>
-        <w:t xml:space="preserve"> laser induced heating is used as a switching method, the phase transition of every </w:t>
+        <w:t xml:space="preserve"> which complicates</w:t>
+      </w:r>
+      <w:r>
+        <w:t xml:space="preserve"> the </w:t>
+      </w:r>
+      <w:r>
+        <w:t xml:space="preserve">phase switching setup. When </w:t>
+      </w:r>
+      <w:r>
+        <w:t xml:space="preserve">laser induced heating is used as a switching method, the phase transition of every </w:t>
       </w:r>
       <w:r>
         <w:t>Sb</w:t>
@@ -30644,7 +30662,22 @@
         <w:t>layer</w:t>
       </w:r>
       <w:r>
-        <w:t xml:space="preserve"> will not occur simultaneously </w:t>
+        <w:t>s</w:t>
+      </w:r>
+      <w:r>
+        <w:t xml:space="preserve"> </w:t>
+      </w:r>
+      <w:r>
+        <w:t>would</w:t>
+      </w:r>
+      <w:r>
+        <w:t xml:space="preserve"> not occur simultaneously</w:t>
+      </w:r>
+      <w:r>
+        <w:t>,</w:t>
+      </w:r>
+      <w:r>
+        <w:t xml:space="preserve"> </w:t>
       </w:r>
       <w:r>
         <w:t>and</w:t>
@@ -30686,13 +30719,19 @@
         <w:t>’s</w:t>
       </w:r>
       <w:r>
-        <w:t xml:space="preserve"> self-activating optical limiter. T</w:t>
+        <w:t xml:space="preserve"> self-activating optical limiter</w:t>
+      </w:r>
+      <w:r>
+        <w:t>, t</w:t>
       </w:r>
       <w:r>
         <w:t xml:space="preserve">he </w:t>
       </w:r>
       <w:r>
-        <w:t xml:space="preserve">device </w:t>
+        <w:t>device</w:t>
+      </w:r>
+      <w:r>
+        <w:t xml:space="preserve"> </w:t>
       </w:r>
       <w:r>
         <w:t>has</w:t>
@@ -30928,16 +30967,40 @@
         <w:t xml:space="preserve"> air-side to substrate-side</w:t>
       </w:r>
       <w:r>
-        <w:t xml:space="preserve">. The order </w:t>
-      </w:r>
-      <w:r>
-        <w:t>is determined by the changes in optical field distribution and thermal crosstalk between layers.</w:t>
-      </w:r>
-      <w:r>
-        <w:t xml:space="preserve"> But our device is intended to be use as switchable filter, </w:t>
-      </w:r>
-      <w:r>
-        <w:t xml:space="preserve">and if the phase switching method is electrical heating, the ability to control </w:t>
+        <w:t>, but is</w:t>
+      </w:r>
+      <w:r>
+        <w:t xml:space="preserve"> determined by the changes in optical field distribution and thermal crosstalk between layers.</w:t>
+      </w:r>
+      <w:r>
+        <w:t xml:space="preserve"> But our device is intended to be use as </w:t>
+      </w:r>
+      <w:r>
+        <w:t xml:space="preserve">a </w:t>
+      </w:r>
+      <w:r>
+        <w:t>switchable filter</w:t>
+      </w:r>
+      <w:r>
+        <w:t xml:space="preserve"> which does not require a fast switching speed, </w:t>
+      </w:r>
+      <w:r>
+        <w:t xml:space="preserve">so electrical heating is viable as </w:t>
+      </w:r>
+      <w:r>
+        <w:t>an alternative</w:t>
+      </w:r>
+      <w:r>
+        <w:t xml:space="preserve"> phase switching method. T</w:t>
+      </w:r>
+      <w:r>
+        <w:t xml:space="preserve">he ability to </w:t>
+      </w:r>
+      <w:r>
+        <w:t xml:space="preserve">manually </w:t>
+      </w:r>
+      <w:r>
+        <w:t xml:space="preserve">control </w:t>
       </w:r>
       <w:r>
         <w:t xml:space="preserve">the phase of </w:t>
@@ -30967,7 +31030,25 @@
         <w:t xml:space="preserve"> will</w:t>
       </w:r>
       <w:r>
-        <w:t xml:space="preserve"> enable a multi-mode filter. A simple example using 3-unit-cells edge-filter design described in Table 1 is shown in Fig. XX, where this design consists of 7 layers, 4 being Sb</w:t>
+        <w:t xml:space="preserve"> enable a </w:t>
+      </w:r>
+      <w:r>
+        <w:t>tunable</w:t>
+      </w:r>
+      <w:r>
+        <w:t xml:space="preserve"> filter. </w:t>
+      </w:r>
+      <w:r>
+        <w:t>For the</w:t>
+      </w:r>
+      <w:r>
+        <w:t xml:space="preserve"> same 5-unit-cells edge-filter design</w:t>
+      </w:r>
+      <w:r>
+        <w:t xml:space="preserve"> described in Table 1</w:t>
+      </w:r>
+      <w:r>
+        <w:t>, it consists of 11 layers of Sb</w:t>
       </w:r>
       <w:r>
         <w:rPr>
@@ -30985,45 +31066,231 @@
         <w:t>3</w:t>
       </w:r>
       <w:r>
-        <w:t xml:space="preserve"> layers. This </w:t>
-      </w:r>
-      <w:r>
-        <w:t>has</w:t>
-      </w:r>
-      <w:r>
-        <w:t xml:space="preserve"> </w:t>
-      </w:r>
-      <w:r>
-        <w:t>a total of 2</w:t>
+        <w:t xml:space="preserve"> and MgF</w:t>
+      </w:r>
+      <w:r>
+        <w:rPr>
+          <w:vertAlign w:val="subscript"/>
+        </w:rPr>
+        <w:t>2</w:t>
+      </w:r>
+      <w:r>
+        <w:t>, 6 layers being Sb</w:t>
+      </w:r>
+      <w:r>
+        <w:rPr>
+          <w:vertAlign w:val="subscript"/>
+        </w:rPr>
+        <w:t>2</w:t>
+      </w:r>
+      <w:r>
+        <w:t>Se</w:t>
+      </w:r>
+      <w:r>
+        <w:rPr>
+          <w:vertAlign w:val="subscript"/>
+        </w:rPr>
+        <w:t>3</w:t>
+      </w:r>
+      <w:r>
+        <w:t>, so there would be a total of 2</w:t>
       </w:r>
       <w:r>
         <w:rPr>
           <w:vertAlign w:val="superscript"/>
         </w:rPr>
-        <w:t>4</w:t>
-      </w:r>
-      <w:r>
-        <w:t xml:space="preserve"> combinations </w:t>
-      </w:r>
-      <w:r>
-        <w:t>between</w:t>
-      </w:r>
-      <w:r>
-        <w:t xml:space="preserve"> </w:t>
-      </w:r>
-      <w:r>
-        <w:t xml:space="preserve">each layer being in ON or OFF modes, but only some are shown in Fig. </w:t>
-      </w:r>
-      <w:r>
-        <w:t>12</w:t>
+        <w:t>6</w:t>
+      </w:r>
+      <w:r>
+        <w:t xml:space="preserve"> configuration of Sb</w:t>
+      </w:r>
+      <w:r>
+        <w:rPr>
+          <w:vertAlign w:val="subscript"/>
+        </w:rPr>
+        <w:t>2</w:t>
+      </w:r>
+      <w:r>
+        <w:t>Se</w:t>
+      </w:r>
+      <w:r>
+        <w:rPr>
+          <w:vertAlign w:val="subscript"/>
+        </w:rPr>
+        <w:t>3</w:t>
+      </w:r>
+      <w:r>
+        <w:t xml:space="preserve"> in amorphous or crystalline phases. Figure 12 shows some of the configuration, where the legends denote Sb</w:t>
+      </w:r>
+      <w:r>
+        <w:rPr>
+          <w:vertAlign w:val="subscript"/>
+        </w:rPr>
+        <w:t>2</w:t>
+      </w:r>
+      <w:r>
+        <w:t>Se</w:t>
+      </w:r>
+      <w:r>
+        <w:rPr>
+          <w:vertAlign w:val="subscript"/>
+        </w:rPr>
+        <w:t>3</w:t>
+      </w:r>
+      <w:r>
+        <w:t xml:space="preserve"> in amorphous (a) or crystalline (c) phases, and the ordering from left to right is substrate to air side. The transmittance at 1064 nm can be reduced from 93.4% in ON mode (solid black) in a gradual manner until it’s </w:t>
+      </w:r>
+      <w:r>
+        <w:t>reduced</w:t>
+      </w:r>
+      <w:r>
+        <w:t xml:space="preserve"> to 0% in OFF mode (dotted black)</w:t>
       </w:r>
       <w:r>
         <w:t>.</w:t>
       </w:r>
     </w:p>
     <w:p/>
+    <w:p>
+      <w:r>
+        <w:rPr>
+          <w:noProof/>
+        </w:rPr>
+        <w:drawing>
+          <wp:inline distT="0" distB="0" distL="0" distR="0" wp14:anchorId="6A62A407" wp14:editId="399D306D">
+            <wp:extent cx="3810343" cy="2592000"/>
+            <wp:effectExtent l="0" t="0" r="0" b="0"/>
+            <wp:docPr id="112911840" name="Picture 8"/>
+            <wp:cNvGraphicFramePr>
+              <a:graphicFrameLocks xmlns:a="http://schemas.openxmlformats.org/drawingml/2006/main" noChangeAspect="1"/>
+            </wp:cNvGraphicFramePr>
+            <a:graphic xmlns:a="http://schemas.openxmlformats.org/drawingml/2006/main">
+              <a:graphicData uri="http://schemas.openxmlformats.org/drawingml/2006/picture">
+                <pic:pic xmlns:pic="http://schemas.openxmlformats.org/drawingml/2006/picture">
+                  <pic:nvPicPr>
+                    <pic:cNvPr id="112911840" name="Picture 8"/>
+                    <pic:cNvPicPr/>
+                  </pic:nvPicPr>
+                  <pic:blipFill>
+                    <a:blip r:embed="rId20"/>
+                    <a:stretch>
+                      <a:fillRect/>
+                    </a:stretch>
+                  </pic:blipFill>
+                  <pic:spPr>
+                    <a:xfrm>
+                      <a:off x="0" y="0"/>
+                      <a:ext cx="3810343" cy="2592000"/>
+                    </a:xfrm>
+                    <a:prstGeom prst="rect">
+                      <a:avLst/>
+                    </a:prstGeom>
+                  </pic:spPr>
+                </pic:pic>
+              </a:graphicData>
+            </a:graphic>
+          </wp:inline>
+        </w:drawing>
+      </w:r>
+    </w:p>
+    <w:p>
+      <w:r>
+        <w:rPr>
+          <w:b/>
+          <w:bCs/>
+        </w:rPr>
+        <w:t>Fig.</w:t>
+      </w:r>
+      <w:r>
+        <w:rPr>
+          <w:b/>
+          <w:bCs/>
+        </w:rPr>
+        <w:t xml:space="preserve"> </w:t>
+      </w:r>
+      <w:r>
+        <w:rPr>
+          <w:rFonts w:cstheme="majorBidi"/>
+          <w:b/>
+          <w:bCs/>
+          <w:szCs w:val="20"/>
+          <w:lang w:bidi="th-TH"/>
+        </w:rPr>
+        <w:t>12</w:t>
+      </w:r>
+      <w:r>
+        <w:rPr>
+          <w:rFonts w:cstheme="majorBidi"/>
+          <w:b/>
+          <w:bCs/>
+          <w:szCs w:val="20"/>
+          <w:cs/>
+          <w:lang w:bidi="th-TH"/>
+        </w:rPr>
+        <w:t>.</w:t>
+      </w:r>
+      <w:r>
+        <w:t xml:space="preserve"> Transmittance of </w:t>
+      </w:r>
+      <w:r>
+        <w:t xml:space="preserve">the same </w:t>
+      </w:r>
+      <w:r>
+        <w:t>five</w:t>
+      </w:r>
+      <w:r>
+        <w:t>-unit-cells edge-filter design</w:t>
+      </w:r>
+      <w:r>
+        <w:t xml:space="preserve"> in 8 different configuration</w:t>
+      </w:r>
+      <w:r>
+        <w:t>.</w:t>
+      </w:r>
+      <w:r>
+        <w:t xml:space="preserve"> </w:t>
+      </w:r>
+      <w:r>
+        <w:t xml:space="preserve">Each </w:t>
+      </w:r>
+      <w:r>
+        <w:t>Sb</w:t>
+      </w:r>
+      <w:r>
+        <w:rPr>
+          <w:vertAlign w:val="subscript"/>
+        </w:rPr>
+        <w:t>2</w:t>
+      </w:r>
+      <w:r>
+        <w:t>Se</w:t>
+      </w:r>
+      <w:r>
+        <w:rPr>
+          <w:vertAlign w:val="subscript"/>
+        </w:rPr>
+        <w:t>3</w:t>
+      </w:r>
+      <w:r>
+        <w:t xml:space="preserve"> layer </w:t>
+      </w:r>
+      <w:r>
+        <w:t>is in</w:t>
+      </w:r>
+      <w:r>
+        <w:t xml:space="preserve"> amorphous (a) or crystalline (c) phases</w:t>
+      </w:r>
+      <w:r>
+        <w:t>, and the layouts from left to right are from substrate-side to air-side.</w:t>
+      </w:r>
+    </w:p>
     <w:p/>
     <w:p>
+      <w:pPr>
+        <w:rPr>
+          <w:rFonts w:cstheme="majorBidi"/>
+        </w:rPr>
+      </w:pPr>
       <w:r>
         <w:rPr>
           <w:rStyle w:val="Emphasis"/>
@@ -31042,7 +31309,7 @@
           <w:iCs w:val="0"/>
           <w:sz w:val="20"/>
         </w:rPr>
-        <w:t>It can be clearly seen from Fig. 7 that</w:t>
+        <w:t>It can clear be seen in Fig. 7 that not all</w:t>
       </w:r>
       <w:r>
         <w:rPr>
@@ -31052,23 +31319,7 @@
           <w:iCs w:val="0"/>
           <w:sz w:val="20"/>
         </w:rPr>
-        <w:t xml:space="preserve"> </w:t>
-      </w:r>
-      <w:r>
-        <w:rPr>
-          <w:rStyle w:val="Emphasis"/>
-          <w:rFonts w:cstheme="majorBidi"/>
-          <w:sz w:val="20"/>
-        </w:rPr>
-        <w:t>ΔT</w:t>
-      </w:r>
-      <w:r>
-        <w:rPr>
-          <w:rStyle w:val="Emphasis"/>
-          <w:rFonts w:cstheme="majorBidi"/>
-          <w:sz w:val="20"/>
-        </w:rPr>
-        <w:t xml:space="preserve"> </w:t>
+        <w:t xml:space="preserve"> edge-filter designs have </w:t>
       </w:r>
       <w:r>
         <w:rPr>
@@ -31078,7 +31329,7 @@
           <w:iCs w:val="0"/>
           <w:sz w:val="20"/>
         </w:rPr>
-        <w:t>peak of single-layer and one-unit-cell edge-filter designs blue-shifted from the intended operating wavelength</w:t>
+        <w:t xml:space="preserve">the </w:t>
       </w:r>
       <w:r>
         <w:rPr>
@@ -31088,7 +31339,7 @@
           <w:iCs w:val="0"/>
           <w:sz w:val="20"/>
         </w:rPr>
-        <w:t xml:space="preserve"> (1064 nm) </w:t>
+        <w:t>highest</w:t>
       </w:r>
       <w:r>
         <w:rPr>
@@ -31098,7 +31349,23 @@
           <w:iCs w:val="0"/>
           <w:sz w:val="20"/>
         </w:rPr>
-        <w:t xml:space="preserve">greatly, even the other edge-filter designs </w:t>
+        <w:t xml:space="preserve"> </w:t>
+      </w:r>
+      <w:r>
+        <w:rPr>
+          <w:rStyle w:val="Emphasis"/>
+          <w:rFonts w:cstheme="majorBidi"/>
+          <w:sz w:val="20"/>
+        </w:rPr>
+        <w:t>ΔT</w:t>
+      </w:r>
+      <w:r>
+        <w:rPr>
+          <w:rStyle w:val="Emphasis"/>
+          <w:rFonts w:cstheme="majorBidi"/>
+          <w:sz w:val="20"/>
+        </w:rPr>
+        <w:t xml:space="preserve"> </w:t>
       </w:r>
       <w:r>
         <w:rPr>
@@ -31108,7 +31375,7 @@
           <w:iCs w:val="0"/>
           <w:sz w:val="20"/>
         </w:rPr>
-        <w:t>do not</w:t>
+        <w:t>at th</w:t>
       </w:r>
       <w:r>
         <w:rPr>
@@ -31118,7 +31385,7 @@
           <w:iCs w:val="0"/>
           <w:sz w:val="20"/>
         </w:rPr>
-        <w:t xml:space="preserve"> have </w:t>
+        <w:t xml:space="preserve">is wavelength. </w:t>
       </w:r>
       <w:r>
         <w:rPr>
@@ -31128,7 +31395,7 @@
           <w:iCs w:val="0"/>
           <w:sz w:val="20"/>
         </w:rPr>
-        <w:t>highest</w:t>
+        <w:t>This can be explained by the selection of reference wavelength</w:t>
       </w:r>
       <w:r>
         <w:rPr>
@@ -31138,23 +31405,28 @@
           <w:iCs w:val="0"/>
           <w:sz w:val="20"/>
         </w:rPr>
-        <w:t xml:space="preserve"> </w:t>
-      </w:r>
-      <w:r>
-        <w:rPr>
-          <w:rStyle w:val="Emphasis"/>
-          <w:rFonts w:cstheme="majorBidi"/>
-          <w:sz w:val="20"/>
-        </w:rPr>
-        <w:t>ΔT</w:t>
-      </w:r>
-      <w:r>
-        <w:rPr>
-          <w:rStyle w:val="Emphasis"/>
-          <w:rFonts w:cstheme="majorBidi"/>
-          <w:sz w:val="20"/>
-        </w:rPr>
-        <w:t xml:space="preserve"> </w:t>
+        <w:t xml:space="preserve"> (</w:t>
+      </w:r>
+      <w:r>
+        <w:rPr>
+          <w:i/>
+          <w:iCs/>
+        </w:rPr>
+        <w:t>λ</w:t>
+      </w:r>
+      <w:r>
+        <w:rPr>
+          <w:i/>
+          <w:iCs/>
+          <w:vertAlign w:val="subscript"/>
+        </w:rPr>
+        <w:t xml:space="preserve">0 </w:t>
+      </w:r>
+      <w:r>
+        <w:t>= 740 nm</w:t>
+      </w:r>
+      <w:r>
+        <w:t>)</w:t>
       </w:r>
       <w:r>
         <w:rPr>
@@ -31164,7 +31436,7 @@
           <w:iCs w:val="0"/>
           <w:sz w:val="20"/>
         </w:rPr>
-        <w:t>at the intended 1064 nm</w:t>
+        <w:t xml:space="preserve"> which is done manually, so</w:t>
       </w:r>
       <w:r>
         <w:rPr>
@@ -31174,13 +31446,7 @@
           <w:iCs w:val="0"/>
           <w:sz w:val="20"/>
         </w:rPr>
-        <w:t>. This can be explained by the selection of reference wavelength, which is done manually, so, an optimization schemes could improve the optical performances.</w:t>
-      </w:r>
-      <w:r>
-        <w:rPr>
-          <w:rFonts w:cstheme="majorBidi"/>
-        </w:rPr>
-        <w:t xml:space="preserve"> </w:t>
+        <w:t xml:space="preserve"> an </w:t>
       </w:r>
       <w:r>
         <w:rPr>
@@ -31190,7 +31456,7 @@
           <w:iCs w:val="0"/>
           <w:sz w:val="20"/>
         </w:rPr>
-        <w:t>A</w:t>
+        <w:t>optimization could</w:t>
       </w:r>
       <w:r>
         <w:rPr>
@@ -31200,6 +31466,42 @@
           <w:iCs w:val="0"/>
           <w:sz w:val="20"/>
         </w:rPr>
+        <w:t xml:space="preserve"> be used to</w:t>
+      </w:r>
+      <w:r>
+        <w:rPr>
+          <w:rStyle w:val="Emphasis"/>
+          <w:rFonts w:cstheme="majorBidi"/>
+          <w:i w:val="0"/>
+          <w:iCs w:val="0"/>
+          <w:sz w:val="20"/>
+        </w:rPr>
+        <w:t xml:space="preserve"> improve the optical performances.</w:t>
+      </w:r>
+      <w:r>
+        <w:rPr>
+          <w:rFonts w:cstheme="majorBidi"/>
+        </w:rPr>
+        <w:t xml:space="preserve"> </w:t>
+      </w:r>
+      <w:r>
+        <w:rPr>
+          <w:rStyle w:val="Emphasis"/>
+          <w:rFonts w:cstheme="majorBidi"/>
+          <w:i w:val="0"/>
+          <w:iCs w:val="0"/>
+          <w:sz w:val="20"/>
+        </w:rPr>
+        <w:t>A</w:t>
+      </w:r>
+      <w:r>
+        <w:rPr>
+          <w:rStyle w:val="Emphasis"/>
+          <w:rFonts w:cstheme="majorBidi"/>
+          <w:i w:val="0"/>
+          <w:iCs w:val="0"/>
+          <w:sz w:val="20"/>
+        </w:rPr>
         <w:t xml:space="preserve"> simple optimization scheme, such as merit function found in </w:t>
       </w:r>
       <w:r>
@@ -31239,13 +31541,82 @@
         <w:t xml:space="preserve"> the thickness of each layer. </w:t>
       </w:r>
       <w:r>
-        <w:t xml:space="preserve">Figure XX shows the result of this optimization (dotted) compared the original designs (solid). The optimization was for the lowest reflectance at 1000-1200 </w:t>
-      </w:r>
-      <w:r>
-        <w:t>nm;</w:t>
-      </w:r>
-      <w:r>
-        <w:t xml:space="preserve"> the goals was set at an interval of 20 nm.</w:t>
+        <w:t>For example, we set t</w:t>
+      </w:r>
+      <w:r>
+        <w:t xml:space="preserve">he optimization </w:t>
+      </w:r>
+      <w:r>
+        <w:t>goals to</w:t>
+      </w:r>
+      <w:r>
+        <w:t xml:space="preserve"> </w:t>
+      </w:r>
+      <w:r>
+        <w:t>highest</w:t>
+      </w:r>
+      <w:r>
+        <w:t xml:space="preserve"> </w:t>
+      </w:r>
+      <w:r>
+        <w:t>transmittance</w:t>
+      </w:r>
+      <w:r>
+        <w:t xml:space="preserve"> </w:t>
+      </w:r>
+      <w:r>
+        <w:t>in an interval of 20 nm starting from 1000 to 1200 nm. The optimized design now required XXX nm of Sb</w:t>
+      </w:r>
+      <w:r>
+        <w:rPr>
+          <w:vertAlign w:val="subscript"/>
+        </w:rPr>
+        <w:t>2</w:t>
+      </w:r>
+      <w:r>
+        <w:t>Se</w:t>
+      </w:r>
+      <w:r>
+        <w:rPr>
+          <w:vertAlign w:val="subscript"/>
+        </w:rPr>
+        <w:t>3</w:t>
+      </w:r>
+      <w:r>
+        <w:t>, and is overall XXX nm thick (XX nm XXX than the original).</w:t>
+      </w:r>
+      <w:r>
+        <w:rPr>
+          <w:rFonts w:cstheme="majorBidi"/>
+        </w:rPr>
+        <w:t xml:space="preserve"> </w:t>
+      </w:r>
+      <w:r>
+        <w:t xml:space="preserve">Figure </w:t>
+      </w:r>
+      <w:r>
+        <w:t>13</w:t>
+      </w:r>
+      <w:r>
+        <w:t xml:space="preserve"> shows the</w:t>
+      </w:r>
+      <w:r>
+        <w:t xml:space="preserve"> transmittance</w:t>
+      </w:r>
+      <w:r>
+        <w:t xml:space="preserve"> </w:t>
+      </w:r>
+      <w:r>
+        <w:t>of 5-unit-cells edge-filter design after</w:t>
+      </w:r>
+      <w:r>
+        <w:t xml:space="preserve"> optimization (dotted) compared </w:t>
+      </w:r>
+      <w:r>
+        <w:t>before optimization</w:t>
+      </w:r>
+      <w:r>
+        <w:t xml:space="preserve"> (solid). </w:t>
       </w:r>
     </w:p>
     <w:p/>
@@ -31432,6 +31803,7 @@
     </w:p>
     <w:p>
       <w:r>
+        <w:lastRenderedPageBreak/>
         <w:tab/>
         <w:t>Future research should be focus on thermal simulation or real-world fabrication. The latter is especially encouraged since further complication that can’t be accounted in a simulation, such as thickness control and materials limitation in each deposition method, could be the most important criteria in design selection.</w:t>
       </w:r>
@@ -31835,7 +32207,6 @@
           <w:iCs w:val="0"/>
           <w:sz w:val="20"/>
         </w:rPr>
-        <w:lastRenderedPageBreak/>
         <w:t>6</w:t>
       </w:r>
       <w:r>
@@ -31867,7 +32238,7 @@
       </w:r>
     </w:p>
     <w:p>
-      <w:hyperlink r:id="rId20" w:history="1">
+      <w:hyperlink r:id="rId21" w:history="1">
         <w:r>
           <w:rPr>
             <w:rStyle w:val="Hyperlink"/>
@@ -31883,7 +32254,7 @@
           <w:szCs w:val="20"/>
         </w:rPr>
       </w:pPr>
-      <w:hyperlink r:id="rId21" w:history="1">
+      <w:hyperlink r:id="rId22" w:history="1">
         <w:r>
           <w:rPr>
             <w:rStyle w:val="Hyperlink"/>
@@ -33001,6 +33372,7 @@
     </w:p>
     <w:p>
       <w:r>
+        <w:lastRenderedPageBreak/>
         <w:tab/>
         <w:t>Vo</w:t>
       </w:r>
@@ -33259,7 +33631,7 @@
       <w:r>
         <w:t xml:space="preserve">vol. 14, no. 6, p. 1259, 2023. [Online]. Available: </w:t>
       </w:r>
-      <w:hyperlink r:id="rId22" w:history="1">
+      <w:hyperlink r:id="rId23" w:history="1">
         <w:r>
           <w:rPr>
             <w:rStyle w:val="Hyperlink"/>
@@ -33407,7 +33779,7 @@
       <w:r>
         <w:t xml:space="preserve">vol. 15, no. 6, p. 2100001, 2021, doi: </w:t>
       </w:r>
-      <w:hyperlink r:id="rId23" w:history="1">
+      <w:hyperlink r:id="rId24" w:history="1">
         <w:r>
           <w:rPr>
             <w:rStyle w:val="Hyperlink"/>
@@ -33425,7 +33797,6 @@
         <w:ind w:left="720" w:hanging="720"/>
       </w:pPr>
       <w:r>
-        <w:lastRenderedPageBreak/>
         <w:t>[8]</w:t>
       </w:r>
       <w:r>
@@ -33472,7 +33843,7 @@
       <w:r>
         <w:t xml:space="preserve">, 12–17 Sept. 2022 2022, pp. 148–150, doi: 10.1109/Metamaterials54993.2022.9920767. [Online]. Available: </w:t>
       </w:r>
-      <w:hyperlink r:id="rId24" w:history="1">
+      <w:hyperlink r:id="rId25" w:history="1">
         <w:r>
           <w:rPr>
             <w:rStyle w:val="Hyperlink"/>
@@ -33545,7 +33916,7 @@
       <w:r>
         <w:t xml:space="preserve">vol. 13, no. 2, p. 148, 2026. [Online]. Available: </w:t>
       </w:r>
-      <w:hyperlink r:id="rId25" w:history="1">
+      <w:hyperlink r:id="rId26" w:history="1">
         <w:r>
           <w:rPr>
             <w:rStyle w:val="Hyperlink"/>
@@ -33684,7 +34055,7 @@
       <w:r>
         <w:t xml:space="preserve">vol. 18, p. 100364, 2023/06/01/ 2023, doi: </w:t>
       </w:r>
-      <w:hyperlink r:id="rId26" w:history="1">
+      <w:hyperlink r:id="rId27" w:history="1">
         <w:r>
           <w:rPr>
             <w:rStyle w:val="Hyperlink"/>
@@ -33845,7 +34216,7 @@
       <w:r>
         <w:t xml:space="preserve">vol. 14, no. 19, p. 4250, 2022. [Online]. Available: </w:t>
       </w:r>
-      <w:hyperlink r:id="rId27" w:history="1">
+      <w:hyperlink r:id="rId28" w:history="1">
         <w:r>
           <w:rPr>
             <w:rStyle w:val="Hyperlink"/>
@@ -33918,7 +34289,7 @@
       <w:r>
         <w:t xml:space="preserve">vol. 150, p. 106907, 2022/11/01/ 2022, doi: </w:t>
       </w:r>
-      <w:hyperlink r:id="rId28" w:history="1">
+      <w:hyperlink r:id="rId29" w:history="1">
         <w:r>
           <w:rPr>
             <w:rStyle w:val="Hyperlink"/>
@@ -33936,6 +34307,7 @@
         <w:ind w:left="720" w:hanging="720"/>
       </w:pPr>
       <w:r>
+        <w:lastRenderedPageBreak/>
         <w:t>[25]</w:t>
       </w:r>
       <w:r>
@@ -34004,7 +34376,7 @@
       <w:r>
         <w:t xml:space="preserve">vol. 34, no. 14, p. 2310306, 2024, doi: </w:t>
       </w:r>
-      <w:hyperlink r:id="rId29" w:history="1">
+      <w:hyperlink r:id="rId30" w:history="1">
         <w:r>
           <w:rPr>
             <w:rStyle w:val="Hyperlink"/>
@@ -34081,7 +34453,7 @@
       <w:r>
         <w:t xml:space="preserve">vol. 421, pp. 424–429, 2017/11/01/ 2017, doi: </w:t>
       </w:r>
-      <w:hyperlink r:id="rId30" w:history="1">
+      <w:hyperlink r:id="rId31" w:history="1">
         <w:r>
           <w:rPr>
             <w:rStyle w:val="Hyperlink"/>
@@ -34198,7 +34570,7 @@
       <w:r>
         <w:t xml:space="preserve">vol. 763, p. 139568, 2022/12/01/ 2022, doi: </w:t>
       </w:r>
-      <w:hyperlink r:id="rId31" w:history="1">
+      <w:hyperlink r:id="rId32" w:history="1">
         <w:r>
           <w:rPr>
             <w:rStyle w:val="Hyperlink"/>
@@ -34231,7 +34603,7 @@
       <w:r>
         <w:t xml:space="preserve">vol. 19, no. 24, p. e01014, 2025, doi: </w:t>
       </w:r>
-      <w:hyperlink r:id="rId32" w:history="1">
+      <w:hyperlink r:id="rId33" w:history="1">
         <w:r>
           <w:rPr>
             <w:rStyle w:val="Hyperlink"/>
@@ -34249,7 +34621,6 @@
         <w:ind w:left="720" w:hanging="720"/>
       </w:pPr>
       <w:r>
-        <w:lastRenderedPageBreak/>
         <w:t>[36]</w:t>
       </w:r>
       <w:r>
@@ -34905,7 +35276,7 @@
   <w:style w:type="paragraph" w:default="1" w:styleId="Normal">
     <w:name w:val="Normal"/>
     <w:qFormat/>
-    <w:rsid w:val="005A5CC1"/>
+    <w:rsid w:val="0046244B"/>
     <w:pPr>
       <w:spacing w:after="0" w:line="240" w:lineRule="auto"/>
       <w:jc w:val="both"/>

</xml_diff>